<commit_message>
Adding Final Report  and commiting final changes to the streamlit app
</commit_message>
<xml_diff>
--- a/Report from dream Team.docx
+++ b/Report from dream Team.docx
@@ -235,6 +235,298 @@
           <w:lang w:val="en-US"/>
         </w:rPr>
         <w:t>view</w:t>
+      </w:r>
+    </w:p>
+    <w:p>
+      <w:proofErr w:type="spellStart"/>
+      <w:r>
+        <w:rPr>
+          <w:rFonts w:ascii="Aptos" w:eastAsia="Aptos" w:hAnsi="Aptos"/>
+          <w:b/>
+          <w:kern w:val="0"/>
+          <w:sz w:val="20"/>
+          <w:lang w:val="en-US"/>
+          <w14:ligatures w14:val="none"/>
+        </w:rPr>
+        <w:t>Streamlit</w:t>
+      </w:r>
+      <w:proofErr w:type="spellEnd"/>
+      <w:r>
+        <w:rPr>
+          <w:b/>
+          <w:bCs/>
+        </w:rPr>
+        <w:t xml:space="preserve"> </w:t>
+      </w:r>
+      <w:r>
+        <w:rPr>
+          <w:rFonts w:ascii="Aptos" w:eastAsia="Aptos" w:hAnsi="Aptos"/>
+          <w:bCs/>
+          <w:kern w:val="0"/>
+          <w:sz w:val="20"/>
+          <w14:ligatures w14:val="none"/>
+        </w:rPr>
+        <w:t>w</w:t>
+      </w:r>
+      <w:r>
+        <w:rPr>
+          <w:rFonts w:ascii="Aptos" w:eastAsia="Aptos" w:hAnsi="Aptos"/>
+          <w:bCs/>
+          <w:kern w:val="0"/>
+          <w:sz w:val="20"/>
+          <w14:ligatures w14:val="none"/>
+        </w:rPr>
+        <w:t>a</w:t>
+      </w:r>
+      <w:r>
+        <w:rPr>
+          <w:rFonts w:ascii="Aptos" w:eastAsia="Aptos" w:hAnsi="Aptos"/>
+          <w:bCs/>
+          <w:kern w:val="0"/>
+          <w:sz w:val="20"/>
+          <w14:ligatures w14:val="none"/>
+        </w:rPr>
+        <w:t>s</w:t>
+      </w:r>
+      <w:r>
+        <w:rPr>
+          <w:rFonts w:ascii="Aptos" w:eastAsia="Aptos" w:hAnsi="Aptos"/>
+          <w:bCs/>
+          <w:kern w:val="0"/>
+          <w:sz w:val="20"/>
+          <w14:ligatures w14:val="none"/>
+        </w:rPr>
+        <w:t xml:space="preserve"> used to build the user interface of the application. </w:t>
+      </w:r>
+      <w:r>
+        <w:rPr>
+          <w:rFonts w:ascii="Aptos" w:eastAsia="Aptos" w:hAnsi="Aptos"/>
+          <w:bCs/>
+          <w:kern w:val="0"/>
+          <w:sz w:val="20"/>
+          <w14:ligatures w14:val="none"/>
+        </w:rPr>
+        <w:t>We</w:t>
+      </w:r>
+      <w:r>
+        <w:rPr>
+          <w:rFonts w:ascii="Aptos" w:eastAsia="Aptos" w:hAnsi="Aptos"/>
+          <w:bCs/>
+          <w:kern w:val="0"/>
+          <w:sz w:val="20"/>
+          <w14:ligatures w14:val="none"/>
+        </w:rPr>
+        <w:t xml:space="preserve"> </w:t>
+      </w:r>
+      <w:r>
+        <w:rPr>
+          <w:rFonts w:ascii="Aptos" w:eastAsia="Aptos" w:hAnsi="Aptos"/>
+          <w:bCs/>
+          <w:kern w:val="0"/>
+          <w:sz w:val="20"/>
+          <w14:ligatures w14:val="none"/>
+        </w:rPr>
+        <w:t>use</w:t>
+      </w:r>
+      <w:r>
+        <w:rPr>
+          <w:rFonts w:ascii="Aptos" w:eastAsia="Aptos" w:hAnsi="Aptos"/>
+          <w:bCs/>
+          <w:kern w:val="0"/>
+          <w:sz w:val="20"/>
+          <w14:ligatures w14:val="none"/>
+        </w:rPr>
+        <w:t>d</w:t>
+      </w:r>
+      <w:r>
+        <w:rPr>
+          <w:rFonts w:ascii="Aptos" w:eastAsia="Aptos" w:hAnsi="Aptos"/>
+          <w:bCs/>
+          <w:kern w:val="0"/>
+          <w:sz w:val="20"/>
+          <w14:ligatures w14:val="none"/>
+        </w:rPr>
+        <w:t xml:space="preserve"> </w:t>
+      </w:r>
+      <w:r>
+        <w:rPr>
+          <w:rFonts w:ascii="Aptos" w:eastAsia="Aptos" w:hAnsi="Aptos"/>
+          <w:bCs/>
+          <w:kern w:val="0"/>
+          <w:sz w:val="20"/>
+          <w14:ligatures w14:val="none"/>
+        </w:rPr>
+        <w:t>the</w:t>
+      </w:r>
+      <w:r>
+        <w:rPr>
+          <w:rFonts w:ascii="Aptos" w:eastAsia="Aptos" w:hAnsi="Aptos"/>
+          <w:bCs/>
+          <w:kern w:val="0"/>
+          <w:sz w:val="20"/>
+          <w14:ligatures w14:val="none"/>
+        </w:rPr>
+        <w:t xml:space="preserve"> </w:t>
+      </w:r>
+      <w:r>
+        <w:rPr>
+          <w:rFonts w:ascii="Aptos" w:eastAsia="Aptos" w:hAnsi="Aptos"/>
+          <w:bCs/>
+          <w:kern w:val="0"/>
+          <w:sz w:val="20"/>
+          <w14:ligatures w14:val="none"/>
+        </w:rPr>
+        <w:t>navigation buttons between pages, input fields for transaction data</w:t>
+      </w:r>
+      <w:r>
+        <w:rPr>
+          <w:rFonts w:ascii="Aptos" w:eastAsia="Aptos" w:hAnsi="Aptos"/>
+          <w:bCs/>
+          <w:kern w:val="0"/>
+          <w:sz w:val="20"/>
+          <w14:ligatures w14:val="none"/>
+        </w:rPr>
+        <w:t xml:space="preserve"> input</w:t>
+      </w:r>
+      <w:r>
+        <w:rPr>
+          <w:rFonts w:ascii="Aptos" w:eastAsia="Aptos" w:hAnsi="Aptos"/>
+          <w:bCs/>
+          <w:kern w:val="0"/>
+          <w:sz w:val="20"/>
+          <w14:ligatures w14:val="none"/>
+        </w:rPr>
+        <w:t xml:space="preserve">, a button to initiate the prediction, and interface elements for displaying </w:t>
+      </w:r>
+      <w:proofErr w:type="spellStart"/>
+      <w:r>
+        <w:rPr>
+          <w:rFonts w:ascii="Aptos" w:eastAsia="Aptos" w:hAnsi="Aptos"/>
+          <w:bCs/>
+          <w:kern w:val="0"/>
+          <w:sz w:val="20"/>
+          <w14:ligatures w14:val="none"/>
+        </w:rPr>
+        <w:t>DataFrames</w:t>
+      </w:r>
+      <w:proofErr w:type="spellEnd"/>
+      <w:r>
+        <w:rPr>
+          <w:rFonts w:ascii="Aptos" w:eastAsia="Aptos" w:hAnsi="Aptos"/>
+          <w:bCs/>
+          <w:kern w:val="0"/>
+          <w:sz w:val="20"/>
+          <w14:ligatures w14:val="none"/>
+        </w:rPr>
+        <w:t xml:space="preserve"> and text outputs.</w:t>
+      </w:r>
+    </w:p>
+    <w:p>
+      <w:pPr>
+        <w:rPr>
+          <w:rFonts w:ascii="Aptos" w:eastAsia="Aptos" w:hAnsi="Aptos"/>
+          <w:bCs/>
+          <w:kern w:val="0"/>
+          <w:sz w:val="20"/>
+          <w14:ligatures w14:val="none"/>
+        </w:rPr>
+      </w:pPr>
+      <w:r>
+        <w:rPr>
+          <w:rFonts w:ascii="Aptos" w:eastAsia="Aptos" w:hAnsi="Aptos"/>
+          <w:b/>
+          <w:kern w:val="0"/>
+          <w:sz w:val="20"/>
+          <w:lang w:val="en-US"/>
+          <w14:ligatures w14:val="none"/>
+        </w:rPr>
+        <w:t>SQL</w:t>
+      </w:r>
+      <w:r>
+        <w:rPr>
+          <w:b/>
+          <w:bCs/>
+        </w:rPr>
+        <w:t xml:space="preserve"> </w:t>
+      </w:r>
+      <w:r>
+        <w:rPr>
+          <w:rFonts w:ascii="Aptos" w:eastAsia="Aptos" w:hAnsi="Aptos"/>
+          <w:b/>
+          <w:kern w:val="0"/>
+          <w:sz w:val="20"/>
+          <w:lang w:val="en-US"/>
+          <w14:ligatures w14:val="none"/>
+        </w:rPr>
+        <w:t>queries</w:t>
+      </w:r>
+      <w:r>
+        <w:t xml:space="preserve"> (</w:t>
+      </w:r>
+      <w:r>
+        <w:rPr>
+          <w:rFonts w:ascii="Aptos" w:eastAsia="Aptos" w:hAnsi="Aptos"/>
+          <w:bCs/>
+          <w:kern w:val="0"/>
+          <w:sz w:val="20"/>
+          <w14:ligatures w14:val="none"/>
+        </w:rPr>
+        <w:t xml:space="preserve">through </w:t>
+      </w:r>
+      <w:proofErr w:type="spellStart"/>
+      <w:r>
+        <w:rPr>
+          <w:rFonts w:ascii="Aptos" w:eastAsia="Aptos" w:hAnsi="Aptos"/>
+          <w:bCs/>
+          <w:kern w:val="0"/>
+          <w:sz w:val="20"/>
+          <w14:ligatures w14:val="none"/>
+        </w:rPr>
+        <w:t>pandasql</w:t>
+      </w:r>
+      <w:proofErr w:type="spellEnd"/>
+      <w:r>
+        <w:rPr>
+          <w:rFonts w:ascii="Aptos" w:eastAsia="Aptos" w:hAnsi="Aptos"/>
+          <w:bCs/>
+          <w:kern w:val="0"/>
+          <w:sz w:val="20"/>
+          <w14:ligatures w14:val="none"/>
+        </w:rPr>
+        <w:t xml:space="preserve">) </w:t>
+      </w:r>
+      <w:r>
+        <w:rPr>
+          <w:rFonts w:ascii="Aptos" w:eastAsia="Aptos" w:hAnsi="Aptos"/>
+          <w:bCs/>
+          <w:kern w:val="0"/>
+          <w:sz w:val="20"/>
+          <w14:ligatures w14:val="none"/>
+        </w:rPr>
+        <w:t xml:space="preserve">were used </w:t>
+      </w:r>
+      <w:r>
+        <w:rPr>
+          <w:rFonts w:ascii="Aptos" w:eastAsia="Aptos" w:hAnsi="Aptos"/>
+          <w:bCs/>
+          <w:kern w:val="0"/>
+          <w:sz w:val="20"/>
+          <w14:ligatures w14:val="none"/>
+        </w:rPr>
+        <w:t>for filtering the initial dataset during data</w:t>
+      </w:r>
+      <w:r>
+        <w:t xml:space="preserve"> </w:t>
+      </w:r>
+      <w:r>
+        <w:rPr>
+          <w:rFonts w:ascii="Aptos" w:eastAsia="Aptos" w:hAnsi="Aptos"/>
+          <w:bCs/>
+          <w:kern w:val="0"/>
+          <w:sz w:val="20"/>
+          <w14:ligatures w14:val="none"/>
+        </w:rPr>
+        <w:t xml:space="preserve">preparation and for producing statistical results on the Statistics page. </w:t>
       </w:r>
     </w:p>
     <w:p>
@@ -314,9 +606,10 @@
           <w:szCs w:val="38"/>
           <w:lang w:val="en-US"/>
         </w:rPr>
+        <w:lastRenderedPageBreak/>
         <w:drawing>
-          <wp:inline distT="0" distB="0" distL="0" distR="0" wp14:anchorId="76A471CD" wp14:editId="1DD200AB">
-            <wp:extent cx="4934607" cy="3246111"/>
+          <wp:inline distT="0" distB="0" distL="0" distR="0" wp14:anchorId="76A471CD" wp14:editId="78D06AFA">
+            <wp:extent cx="4903428" cy="3225600"/>
             <wp:effectExtent l="0" t="0" r="0" b="0"/>
             <wp:docPr id="1783112832" name="Picture 1"/>
             <wp:cNvGraphicFramePr>
@@ -338,7 +631,7 @@
                   <pic:spPr>
                     <a:xfrm>
                       <a:off x="0" y="0"/>
-                      <a:ext cx="4976207" cy="3273476"/>
+                      <a:ext cx="5010751" cy="3296200"/>
                     </a:xfrm>
                     <a:prstGeom prst="rect">
                       <a:avLst/>
@@ -365,7 +658,6 @@
           <w:szCs w:val="38"/>
           <w:lang w:val="en-US"/>
         </w:rPr>
-        <w:lastRenderedPageBreak/>
         <w:t>Architecture:</w:t>
       </w:r>
     </w:p>
@@ -383,9 +675,9 @@
           <w:lang w:val="en-US"/>
         </w:rPr>
         <w:drawing>
-          <wp:inline distT="0" distB="0" distL="0" distR="0" wp14:anchorId="3162491A" wp14:editId="229B30A8">
-            <wp:extent cx="5692633" cy="6416596"/>
-            <wp:effectExtent l="0" t="0" r="3810" b="3810"/>
+          <wp:inline distT="0" distB="0" distL="0" distR="0" wp14:anchorId="3162491A" wp14:editId="01194BF6">
+            <wp:extent cx="4003200" cy="4512308"/>
+            <wp:effectExtent l="0" t="0" r="0" b="3175"/>
             <wp:docPr id="1235986837" name="Picture 1"/>
             <wp:cNvGraphicFramePr>
               <a:graphicFrameLocks xmlns:a="http://schemas.openxmlformats.org/drawingml/2006/main" noChangeAspect="1"/>
@@ -406,7 +698,7 @@
                   <pic:spPr>
                     <a:xfrm>
                       <a:off x="0" y="0"/>
-                      <a:ext cx="5692633" cy="6416596"/>
+                      <a:ext cx="4025999" cy="4538007"/>
                     </a:xfrm>
                     <a:prstGeom prst="rect">
                       <a:avLst/>
@@ -1007,6 +1299,7 @@
           <w:szCs w:val="38"/>
           <w:lang w:val="en-US"/>
         </w:rPr>
+        <w:lastRenderedPageBreak/>
         <w:t>Implementation</w:t>
       </w:r>
     </w:p>
@@ -1289,7 +1582,6 @@
         <w:rPr>
           <w:lang w:val="en-US"/>
         </w:rPr>
-        <w:lastRenderedPageBreak/>
         <w:t>Furthermore, t</w:t>
       </w:r>
       <w:r>
@@ -1386,6 +1678,7 @@
           <w:noProof/>
           <w:lang w:val="en-US"/>
         </w:rPr>
+        <w:lastRenderedPageBreak/>
         <w:drawing>
           <wp:inline distT="0" distB="0" distL="0" distR="0" wp14:anchorId="619F0093" wp14:editId="546E5A65">
             <wp:extent cx="6751320" cy="3197860"/>
@@ -2641,6 +2934,7 @@
   <w:style w:type="character" w:default="1" w:styleId="DefaultParagraphFont">
     <w:name w:val="Default Paragraph Font"/>
     <w:uiPriority w:val="1"/>
+    <w:semiHidden/>
     <w:unhideWhenUsed/>
   </w:style>
   <w:style w:type="table" w:default="1" w:styleId="TableNormal">

</xml_diff>